<commit_message>
Corbeille et restauration des offres
</commit_message>
<xml_diff>
--- a/Service URI.docx
+++ b/Service URI.docx
@@ -251,194 +251,248 @@
       <w:r>
         <w:t xml:space="preserve"> client123    client@freelance.com</w:t>
       </w:r>
+    </w:p>
+    <w:p/>
+    <w:p/>
+    <w:p>
+      <w:pPr>
+        <w:rPr>
+          <w:b/>
+          <w:sz w:val="26"/>
+        </w:rPr>
+      </w:pPr>
+      <w:r>
+        <w:rPr>
+          <w:b/>
+          <w:sz w:val="26"/>
+        </w:rPr>
+        <w:t>GitHub — ton code source</w:t>
+      </w:r>
+    </w:p>
+    <w:p>
+      <w:r>
+        <w:t xml:space="preserve">Rôle : héberge ton COMPTE (le code de ton projet </w:t>
+      </w:r>
+      <w:proofErr w:type="spellStart"/>
+      <w:r>
+        <w:t>Laravel</w:t>
+      </w:r>
+      <w:proofErr w:type="spellEnd"/>
+      <w:r>
+        <w:t>), c'est la sauvegarde de référence. Accès : va sur github.com, connecte-toi avec ton compte (bakayokosalif81), puis clique sur ton dépôt "mon_freelance_emploi-laravel1" dans la liste de tes repositories.</w:t>
+      </w:r>
+    </w:p>
+    <w:p>
+      <w:pPr>
+        <w:rPr>
+          <w:b/>
+          <w:sz w:val="26"/>
+        </w:rPr>
+      </w:pPr>
+      <w:proofErr w:type="spellStart"/>
+      <w:r>
+        <w:rPr>
+          <w:b/>
+          <w:sz w:val="26"/>
+        </w:rPr>
+        <w:t>Render</w:t>
+      </w:r>
+      <w:proofErr w:type="spellEnd"/>
+      <w:r>
+        <w:rPr>
+          <w:b/>
+          <w:sz w:val="26"/>
+        </w:rPr>
+        <w:t xml:space="preserve"> — ton hébergement web</w:t>
+      </w:r>
+    </w:p>
+    <w:p>
+      <w:r>
+        <w:t>Rôle : héberge ton APPLICATION EN LIGNE (le site que les visiteurs voient). Accès : va sur dashboard.render.com, connecte-toi avec "</w:t>
+      </w:r>
+      <w:proofErr w:type="spellStart"/>
+      <w:r>
+        <w:t>Sign</w:t>
+      </w:r>
+      <w:proofErr w:type="spellEnd"/>
+      <w:r>
+        <w:t xml:space="preserve"> in </w:t>
+      </w:r>
+      <w:proofErr w:type="spellStart"/>
+      <w:r>
+        <w:t>with</w:t>
+      </w:r>
+      <w:proofErr w:type="spellEnd"/>
+      <w:r>
+        <w:t xml:space="preserve"> GitHub" (même compte GitHub), puis clique sur ton service "mon_freelance_emploi-laravel1". C'est ici que tu gères les variables d'environnement, consultes les logs, et relances des déploiements.</w:t>
+      </w:r>
+    </w:p>
+    <w:p>
+      <w:pPr>
+        <w:rPr>
+          <w:b/>
+          <w:sz w:val="26"/>
+        </w:rPr>
+      </w:pPr>
+      <w:proofErr w:type="spellStart"/>
+      <w:r>
+        <w:rPr>
+          <w:b/>
+          <w:sz w:val="26"/>
+        </w:rPr>
+        <w:lastRenderedPageBreak/>
+        <w:t>Aiven</w:t>
+      </w:r>
+      <w:proofErr w:type="spellEnd"/>
+      <w:r>
+        <w:rPr>
+          <w:b/>
+          <w:sz w:val="26"/>
+        </w:rPr>
+        <w:t xml:space="preserve"> — ta base de données</w:t>
+      </w:r>
+    </w:p>
+    <w:p>
+      <w:r>
+        <w:t xml:space="preserve">Rôle : héberge ta BASE DE DONNÉES MySQL en ligne (tous les comptes utilisateurs, offres, candidatures, etc.). Accès : va sur console.aiven.io, connecte-toi avec le compte que tu as créé, puis clique sur ton service "mysql-2f73926f". </w:t>
+      </w:r>
+      <w:r>
+        <w:rPr>
+          <w:rFonts w:ascii="Segoe UI Emoji" w:hAnsi="Segoe UI Emoji" w:cs="Segoe UI Emoji"/>
+        </w:rPr>
+        <w:t>⚠</w:t>
+      </w:r>
+      <w:r>
+        <w:t>️ Vérifie toujours le statut affiché ("Running" ou "</w:t>
+      </w:r>
+      <w:proofErr w:type="spellStart"/>
+      <w:r>
+        <w:t>Powered</w:t>
+      </w:r>
+      <w:proofErr w:type="spellEnd"/>
+      <w:r>
+        <w:t xml:space="preserve"> off") — s'il est éteint, clique sur le bouton pour le relancer.</w:t>
+      </w:r>
+    </w:p>
+    <w:p>
+      <w:pPr>
+        <w:rPr>
+          <w:b/>
+          <w:sz w:val="26"/>
+        </w:rPr>
+      </w:pPr>
+      <w:proofErr w:type="spellStart"/>
+      <w:r>
+        <w:rPr>
+          <w:b/>
+          <w:sz w:val="26"/>
+        </w:rPr>
+        <w:t>HeidiSQL</w:t>
+      </w:r>
+      <w:proofErr w:type="spellEnd"/>
+      <w:r>
+        <w:rPr>
+          <w:b/>
+          <w:sz w:val="26"/>
+        </w:rPr>
+        <w:t xml:space="preserve"> — outil sur ton PC</w:t>
+      </w:r>
+    </w:p>
+    <w:p>
+      <w:r>
+        <w:t xml:space="preserve">Rôle : logiciel installé sur TON PC qui te permet de te connecter directement à la base </w:t>
+      </w:r>
+      <w:proofErr w:type="spellStart"/>
+      <w:r>
+        <w:t>Aiven</w:t>
+      </w:r>
+      <w:proofErr w:type="spellEnd"/>
+      <w:r>
+        <w:t xml:space="preserve"> pour voir/modifier les données (comme on l'a fait pour créer l'admin). Accès : ouvre l'application </w:t>
+      </w:r>
+      <w:proofErr w:type="spellStart"/>
+      <w:r>
+        <w:t>HeidiSQL</w:t>
+      </w:r>
+      <w:proofErr w:type="spellEnd"/>
+      <w:r>
+        <w:t xml:space="preserve"> sur ton ordinateur (icône sur le bureau ou menu Démarrer), la connexion qu'on a configurée devrait être sauvegardée — double-clique dessus pour te reconnecter directement.</w:t>
+      </w:r>
+    </w:p>
+    <w:p>
+      <w:pPr>
+        <w:rPr>
+          <w:b/>
+          <w:sz w:val="26"/>
+        </w:rPr>
+      </w:pPr>
+      <w:r>
+        <w:rPr>
+          <w:b/>
+          <w:sz w:val="26"/>
+        </w:rPr>
+        <w:t>En résumé, ton URL de site final est :</w:t>
+      </w:r>
+    </w:p>
+    <w:p>
+      <w:hyperlink r:id="rId5" w:history="1">
+        <w:r>
+          <w:rPr>
+            <w:rStyle w:val="Lienhypertexte"/>
+          </w:rPr>
+          <w:t>https://mon-freelance-emploi-laravel1.onrender.com</w:t>
+        </w:r>
+      </w:hyperlink>
+    </w:p>
+    <w:p>
+      <w:pPr>
+        <w:rPr>
+          <w:b/>
+          <w:sz w:val="26"/>
+        </w:rPr>
+      </w:pPr>
+      <w:r>
+        <w:rPr>
+          <w:b/>
+          <w:sz w:val="26"/>
+        </w:rPr>
+        <w:t>Petit résumé du workflow complet pour toi :</w:t>
+      </w:r>
+    </w:p>
+    <w:p/>
+    <w:p>
+      <w:r>
+        <w:t>Un client publie une offre en cochant "Mettre en avant — 2000 FCFA"</w:t>
+      </w:r>
+    </w:p>
+    <w:p>
+      <w:r>
+        <w:t>L'offre reste invisible publiq</w:t>
+      </w:r>
       <w:bookmarkStart w:id="0" w:name="_GoBack"/>
       <w:bookmarkEnd w:id="0"/>
-    </w:p>
-    <w:p/>
-    <w:p/>
-    <w:p>
-      <w:pPr>
-        <w:rPr>
-          <w:b/>
-          <w:sz w:val="26"/>
-        </w:rPr>
-      </w:pPr>
-      <w:r>
-        <w:rPr>
-          <w:b/>
-          <w:sz w:val="26"/>
-        </w:rPr>
-        <w:t>GitHub — ton code source</w:t>
-      </w:r>
-    </w:p>
-    <w:p>
-      <w:r>
-        <w:t xml:space="preserve">Rôle : héberge ton COMPTE (le code de ton projet </w:t>
-      </w:r>
-      <w:proofErr w:type="spellStart"/>
-      <w:r>
-        <w:t>Laravel</w:t>
-      </w:r>
-      <w:proofErr w:type="spellEnd"/>
-      <w:r>
-        <w:t>), c'est la sauvegarde de référence. Accès : va sur github.com, connecte-toi avec ton compte (bakayokosalif81), puis clique sur ton dépôt "mon_freelance_emploi-laravel1" dans la liste de tes repositories.</w:t>
-      </w:r>
-    </w:p>
-    <w:p>
-      <w:pPr>
-        <w:rPr>
-          <w:b/>
-          <w:sz w:val="26"/>
-        </w:rPr>
-      </w:pPr>
-      <w:proofErr w:type="spellStart"/>
-      <w:r>
-        <w:rPr>
-          <w:b/>
-          <w:sz w:val="26"/>
-        </w:rPr>
-        <w:t>Render</w:t>
-      </w:r>
-      <w:proofErr w:type="spellEnd"/>
-      <w:r>
-        <w:rPr>
-          <w:b/>
-          <w:sz w:val="26"/>
-        </w:rPr>
-        <w:t xml:space="preserve"> — ton hébergement web</w:t>
-      </w:r>
-    </w:p>
-    <w:p>
-      <w:r>
-        <w:t>Rôle : héberge ton APPLICATION EN LIGNE (le site que les visiteurs voient). Accès : va sur dashboard.render.com, connecte-toi avec "</w:t>
-      </w:r>
-      <w:proofErr w:type="spellStart"/>
-      <w:r>
-        <w:t>Sign</w:t>
-      </w:r>
-      <w:proofErr w:type="spellEnd"/>
-      <w:r>
-        <w:t xml:space="preserve"> in </w:t>
-      </w:r>
-      <w:proofErr w:type="spellStart"/>
-      <w:r>
-        <w:t>with</w:t>
-      </w:r>
-      <w:proofErr w:type="spellEnd"/>
-      <w:r>
-        <w:t xml:space="preserve"> GitHub" (même compte GitHub), puis clique sur ton service "mon_freelance_emploi-laravel1". C'est ici que tu gères les variables d'environnement, consultes les logs, et relances des déploiements.</w:t>
-      </w:r>
-    </w:p>
-    <w:p>
-      <w:pPr>
-        <w:rPr>
-          <w:b/>
-          <w:sz w:val="26"/>
-        </w:rPr>
-      </w:pPr>
-      <w:proofErr w:type="spellStart"/>
-      <w:r>
-        <w:rPr>
-          <w:b/>
-          <w:sz w:val="26"/>
-        </w:rPr>
-        <w:lastRenderedPageBreak/>
-        <w:t>Aiven</w:t>
-      </w:r>
-      <w:proofErr w:type="spellEnd"/>
-      <w:r>
-        <w:rPr>
-          <w:b/>
-          <w:sz w:val="26"/>
-        </w:rPr>
-        <w:t xml:space="preserve"> — ta base de données</w:t>
-      </w:r>
-    </w:p>
-    <w:p>
-      <w:r>
-        <w:t xml:space="preserve">Rôle : héberge ta BASE DE DONNÉES MySQL en ligne (tous les comptes utilisateurs, offres, candidatures, etc.). Accès : va sur console.aiven.io, connecte-toi avec le compte que tu as créé, puis clique sur ton service "mysql-2f73926f". </w:t>
-      </w:r>
-      <w:r>
-        <w:rPr>
-          <w:rFonts w:ascii="Segoe UI Emoji" w:hAnsi="Segoe UI Emoji" w:cs="Segoe UI Emoji"/>
-        </w:rPr>
-        <w:t>⚠</w:t>
-      </w:r>
-      <w:r>
-        <w:t>️ Vérifie toujours le statut affiché ("Running" ou "</w:t>
-      </w:r>
-      <w:proofErr w:type="spellStart"/>
-      <w:r>
-        <w:t>Powered</w:t>
-      </w:r>
-      <w:proofErr w:type="spellEnd"/>
-      <w:r>
-        <w:t xml:space="preserve"> off") — s'il est éteint, clique sur le bouton pour le relancer.</w:t>
-      </w:r>
-    </w:p>
-    <w:p>
-      <w:pPr>
-        <w:rPr>
-          <w:b/>
-          <w:sz w:val="26"/>
-        </w:rPr>
-      </w:pPr>
-      <w:proofErr w:type="spellStart"/>
-      <w:r>
-        <w:rPr>
-          <w:b/>
-          <w:sz w:val="26"/>
-        </w:rPr>
-        <w:t>HeidiSQL</w:t>
-      </w:r>
-      <w:proofErr w:type="spellEnd"/>
-      <w:r>
-        <w:rPr>
-          <w:b/>
-          <w:sz w:val="26"/>
-        </w:rPr>
-        <w:t xml:space="preserve"> — outil sur ton PC</w:t>
-      </w:r>
-    </w:p>
-    <w:p>
-      <w:r>
-        <w:t xml:space="preserve">Rôle : logiciel installé sur TON PC qui te permet de te connecter directement à la base </w:t>
-      </w:r>
-      <w:proofErr w:type="spellStart"/>
-      <w:r>
-        <w:t>Aiven</w:t>
-      </w:r>
-      <w:proofErr w:type="spellEnd"/>
-      <w:r>
-        <w:t xml:space="preserve"> pour voir/modifier les données (comme on l'a fait pour créer l'admin). Accès : ouvre l'application </w:t>
-      </w:r>
-      <w:proofErr w:type="spellStart"/>
-      <w:r>
-        <w:t>HeidiSQL</w:t>
-      </w:r>
-      <w:proofErr w:type="spellEnd"/>
-      <w:r>
-        <w:t xml:space="preserve"> sur ton ordinateur (icône sur le bureau ou menu Démarrer), la connexion qu'on a configurée devrait être sauvegardée — double-clique dessus pour te reconnecter directement.</w:t>
-      </w:r>
-    </w:p>
-    <w:p>
-      <w:pPr>
-        <w:rPr>
-          <w:b/>
-          <w:sz w:val="26"/>
-        </w:rPr>
-      </w:pPr>
-      <w:r>
-        <w:rPr>
-          <w:b/>
-          <w:sz w:val="26"/>
-        </w:rPr>
-        <w:t>En résumé, ton URL de site final est :</w:t>
-      </w:r>
-    </w:p>
-    <w:p>
-      <w:r>
-        <w:t>https://mon-freelance-emploi-laravel1.onrender.com</w:t>
+      <w:r>
+        <w:t xml:space="preserve">uement, le client reçoit les instructions de paiement sur son </w:t>
+      </w:r>
+      <w:proofErr w:type="spellStart"/>
+      <w:r>
+        <w:t>dashboard</w:t>
+      </w:r>
+      <w:proofErr w:type="spellEnd"/>
+    </w:p>
+    <w:p>
+      <w:r>
+        <w:t>Il t'envoie l'argent par Mobile Money</w:t>
+      </w:r>
+    </w:p>
+    <w:p>
+      <w:r>
+        <w:t>Tu vérifies la réception, puis actives la vedette depuis /admin/offres</w:t>
+      </w:r>
+    </w:p>
+    <w:p>
+      <w:r>
+        <w:t>L'offre apparaît en haut de liste avec le badge doré</w:t>
       </w:r>
     </w:p>
     <w:sectPr>

</xml_diff>